<commit_message>
Lab 4 Q30: LEFT JOIN so projects with no work hours count as 0
Co-Authored-By: Claude Sonnet 5.5 <noreply@anthropic.com>
Claude-Session: https://claude.ai/code/session_01SargMTe12nKtrCRsFCRuGG
</commit_message>
<xml_diff>
--- a/output/Lab4.docx
+++ b/output/Lab4.docx
@@ -3675,15 +3675,15 @@
                 <w:color w:val="282828"/>
                 <w:sz w:val="19"/>
               </w:rPr>
-              <w:t>SELECT TOP 1 WITH TIES p.proNum, p.proName, SUM(w.workHours) AS totalHours</w:t>
+              <w:t>SELECT TOP 1 WITH TIES p.proNum, p.proName, ISNULL(SUM(w.workHours), 0) AS totalHours</w:t>
               <w:br/>
               <w:t>FROM tblProject p</w:t>
               <w:br/>
-              <w:t>INNER JOIN tblWorksOn w ON p.proNum = w.proNum</w:t>
+              <w:t>LEFT JOIN tblWorksOn w ON p.proNum = w.proNum</w:t>
               <w:br/>
               <w:t>GROUP BY p.proNum, p.proName</w:t>
               <w:br/>
-              <w:t>ORDER BY totalHours ASC;</w:t>
+              <w:t>ORDER BY ISNULL(SUM(w.workHours), 0) ASC;</w:t>
             </w:r>
           </w:p>
         </w:tc>
@@ -3706,7 +3706,7 @@
         <w:t xml:space="preserve">Technical Explanation: </w:t>
       </w:r>
       <w:r>
-        <w:t>TOP 1 WITH TIES ordered by SUM(workHours) ASC.</w:t>
+        <w:t>LEFT JOIN so projects with no work hours count as 0, TOP 1 WITH TIES ordered by ISNULL(SUM(workHours), 0) ASC.</w:t>
       </w:r>
     </w:p>
     <w:p>

</xml_diff>